<commit_message>
Bobby Kerr KIRP prep v2: stress test, council re-run, EP polish
Round two on the finished v1 document.

The load-bearing fix: v1 instructed D.J. to state an 83% zero-click
figure on air off a source that was never actually opened (the article
403'd). Verified in this pass. It holds, and the check surfaced a
better number: Pew found a cited source gets clicked ~1% of the time
when an AI Overview shows. Q3, title 2, and the data table rebuilt
on it.

Also: wrote the guest intro the document had referenced four times
and never supplied; added a green-room brief including the Rapid Fire
pre-brief; moved two minutes from Block 3 to Block 4 so the block
holding two never-cut questions has the clock; promoted the
ChatGPT-does-not-read-your-GBP finding from a footnote into Q3;
armed Q8 with Google's actual naming and address rules; resolved the
never-cut contradiction and the stat-rule contradiction.

Co-Authored-By: Claude Opus 5 (1M context) <noreply@anthropic.com>
</commit_message>
<xml_diff>
--- a/guest-prep/Bobby_Kerr_Interview_Prep.docx
+++ b/guest-prep/Bobby_Kerr_Interview_Prep.docx
@@ -36,7 +36,242 @@
           <w:i/>
           <w:sz w:val="20"/>
         </w:rPr>
-        <w:t>Founder, LOC8 My Business  |  Google Business Profile optimization for real estate  |  Prepared August 11, 2026</w:t>
+        <w:t>Founder, LOC8 My Business  |  Google Business Profile optimization for real estate  |  Prepared August 11, 2026  |  v2</w:t>
+      </w:r>
+    </w:p>
+    <w:p>
+      <w:pPr>
+        <w:pStyle w:val="Heading1"/>
+      </w:pPr>
+      <w:r>
+        <w:t>WHAT CHANGED IN v2</w:t>
+      </w:r>
+    </w:p>
+    <w:p>
+      <w:pPr>
+        <w:spacing w:after="120"/>
+      </w:pPr>
+      <w:r>
+        <w:rPr>
+          <w:b w:val="0"/>
+          <w:i/>
+          <w:sz w:val="19"/>
+        </w:rPr>
+        <w:t>A second stress test, a council re-run, and a full EP rewrite ran on v1. If you already read v1, these are the only things you need to re-learn.</w:t>
+      </w:r>
+    </w:p>
+    <w:p>
+      <w:pPr>
+        <w:pStyle w:val="ListBullet"/>
+        <w:spacing w:after="40"/>
+      </w:pPr>
+      <w:r>
+        <w:rPr>
+          <w:b/>
+        </w:rPr>
+        <w:t xml:space="preserve">The 83% stat is now verified, and a better number came out of the check. </w:t>
+      </w:r>
+      <w:r>
+        <w:t>v1 told you to say 83% on air off a source I never actually opened. It holds up, but the sharper finding is Pew: when Google shows an AI answer, people click a cited source about 1% of the time. Q3 was rebuilt around it.</w:t>
+      </w:r>
+    </w:p>
+    <w:p>
+      <w:pPr>
+        <w:pStyle w:val="ListBullet"/>
+        <w:spacing w:after="40"/>
+      </w:pPr>
+      <w:r>
+        <w:rPr>
+          <w:b/>
+        </w:rPr>
+        <w:t xml:space="preserve">Q3 now asks about more than Google. </w:t>
+      </w:r>
+      <w:r>
+        <w:t>v1 titled the episode around AI search and then only interrogated Google. Gemini reads the profile directly. ChatGPT largely does not, it leans on Bing Places, Yelp, and Foursquare. That is in his own pitch and v1 buried it in the research brief.</w:t>
+      </w:r>
+    </w:p>
+    <w:p>
+      <w:pPr>
+        <w:pStyle w:val="ListBullet"/>
+        <w:spacing w:after="40"/>
+      </w:pPr>
+      <w:r>
+        <w:rPr>
+          <w:b/>
+        </w:rPr>
+        <w:t xml:space="preserve">There is now a scripted guest intro. </w:t>
+      </w:r>
+      <w:r>
+        <w:t>v1 referenced the intro four separate times in the landmines and never wrote one. That was the biggest hole in the document. See the next page.</w:t>
+      </w:r>
+    </w:p>
+    <w:p>
+      <w:pPr>
+        <w:pStyle w:val="ListBullet"/>
+        <w:spacing w:after="40"/>
+      </w:pPr>
+      <w:r>
+        <w:rPr>
+          <w:b/>
+        </w:rPr>
+        <w:t xml:space="preserve">There is now a green-room brief. </w:t>
+      </w:r>
+      <w:r>
+        <w:t>Three things have to be said before you record, including the one that stops Rapid Fire from burning his best story.</w:t>
+      </w:r>
+    </w:p>
+    <w:p>
+      <w:pPr>
+        <w:pStyle w:val="ListBullet"/>
+        <w:spacing w:after="40"/>
+      </w:pPr>
+      <w:r>
+        <w:rPr>
+          <w:b/>
+        </w:rPr>
+        <w:t xml:space="preserve">Block 3 lost two minutes and Block 4 gained them. </w:t>
+      </w:r>
+      <w:r>
+        <w:t>v1 gave the block with both never-cut questions the least room on the clock. That was backwards. See the council, which is also how the v1 dissent got resolved.</w:t>
+      </w:r>
+    </w:p>
+    <w:p>
+      <w:pPr>
+        <w:pStyle w:val="ListBullet"/>
+        <w:spacing w:after="40"/>
+      </w:pPr>
+      <w:r>
+        <w:rPr>
+          <w:b/>
+        </w:rPr>
+        <w:t xml:space="preserve">The stat rule got precise. </w:t>
+      </w:r>
+      <w:r>
+        <w:t>v1 said no guest-supplied numbers in the descriptions and then put one in the YouTube description. The rule now separates performance claims, which are banned, from volume claims, which are fine when attributed. See Landmine 5.</w:t>
+      </w:r>
+    </w:p>
+    <w:p>
+      <w:pPr>
+        <w:pStyle w:val="ListBullet"/>
+        <w:spacing w:after="40"/>
+      </w:pPr>
+      <w:r>
+        <w:rPr>
+          <w:b/>
+        </w:rPr>
+        <w:t xml:space="preserve">Q10 moved onto the never-cut list. </w:t>
+      </w:r>
+      <w:r>
+        <w:t>v1 called the Rapid Fire callbacks load-bearing and then left both of them cuttable. Contradiction fixed.</w:t>
+      </w:r>
+    </w:p>
+    <w:p>
+      <w:r>
+        <w:br w:type="page"/>
+      </w:r>
+    </w:p>
+    <w:p>
+      <w:pPr>
+        <w:pStyle w:val="Heading1"/>
+      </w:pPr>
+      <w:r>
+        <w:t>THE INTRO (read as written)</w:t>
+      </w:r>
+    </w:p>
+    <w:p>
+      <w:pPr>
+        <w:spacing w:after="120"/>
+      </w:pPr>
+      <w:r>
+        <w:rPr>
+          <w:b w:val="0"/>
+          <w:i/>
+          <w:sz w:val="19"/>
+        </w:rPr>
+        <w:t>This is the safe version. Every landmine in this document is already engineered out of it: no business list, no years, no city, no performance numbers, and no chance of introducing the other Bobby Kerr.</w:t>
+      </w:r>
+    </w:p>
+    <w:p>
+      <w:pPr>
+        <w:spacing w:after="120"/>
+      </w:pPr>
+      <w:r>
+        <w:rPr>
+          <w:b w:val="0"/>
+          <w:i/>
+        </w:rPr>
+        <w:t>"My guest today is Bobby Kerr. He is the founder of LOC8 My Business, which is a marketing agency built around exactly one thing, the Google Business Profile that every real estate agent has and almost nobody has finished. He has rebuilt more than a thousand of them for agents and teams across the United States and Canada. Before this he spent years running businesses inside our industry, and I am going to let him tell you which ones. Bobby, welcome to Keeping It Real."</w:t>
+      </w:r>
+    </w:p>
+    <w:p>
+      <w:pPr>
+        <w:spacing w:after="120"/>
+      </w:pPr>
+      <w:r>
+        <w:rPr>
+          <w:b w:val="0"/>
+          <w:i/>
+          <w:sz w:val="19"/>
+        </w:rPr>
+        <w:t>The line "I am going to let him tell you which ones" is doing real work. It gets his resume on tape in his own words without you asserting a version of it that his own published bios contradict. See Landmine 2.</w:t>
+      </w:r>
+    </w:p>
+    <w:p>
+      <w:pPr>
+        <w:pStyle w:val="Heading2"/>
+      </w:pPr>
+      <w:r>
+        <w:t>GREEN ROOM (say all three before you hit record)</w:t>
+      </w:r>
+    </w:p>
+    <w:p>
+      <w:pPr>
+        <w:pStyle w:val="ListBullet"/>
+        <w:spacing w:after="40"/>
+      </w:pPr>
+      <w:r>
+        <w:rPr>
+          <w:b/>
+        </w:rPr>
+        <w:t xml:space="preserve">1. "How do you say your name, and are you Bobby or Robert on air?" </w:t>
+      </w:r>
+      <w:r>
+        <w:t>Also confirm his pronouns. He uses he and him throughout his own materials but he has never said so in public.</w:t>
+      </w:r>
+    </w:p>
+    <w:p>
+      <w:pPr>
+        <w:pStyle w:val="ListBullet"/>
+        <w:spacing w:after="40"/>
+      </w:pPr>
+      <w:r>
+        <w:rPr>
+          <w:b/>
+        </w:rPr>
+        <w:t xml:space="preserve">2. "Where are you sitting right now?" </w:t>
+      </w:r>
+      <w:r>
+        <w:t>Solves Landmine 3 off air. His company address is Florida and most of his history is Kansas City, and you do not want to find that out live.</w:t>
+      </w:r>
+    </w:p>
+    <w:p>
+      <w:pPr>
+        <w:pStyle w:val="ListBullet"/>
+        <w:spacing w:after="40"/>
+      </w:pPr>
+      <w:r>
+        <w:rPr>
+          <w:b/>
+        </w:rPr>
+        <w:t xml:space="preserve">3. THE IMPORTANT ONE. "I open with four rapid fire questions, including best and worst advice. Keep them short, because I am not going to follow up on them there. Both of your answers are too good to spend in minute one, so we are coming back to them later on purpose." </w:t>
+      </w:r>
+      <w:r>
+        <w:t>This is the fix for the single biggest structural problem with this guest. Without it, he tells his two best stories in ninety seconds to a host who then changes the subject, and the callbacks at Q9 and Q10 land as repetition instead of as a return.</w:t>
+      </w:r>
+    </w:p>
+    <w:p>
+      <w:r>
+        <w:br w:type="page"/>
       </w:r>
     </w:p>
     <w:p>
@@ -309,7 +544,7 @@
           <w:b w:val="0"/>
           <w:i w:val="0"/>
         </w:rPr>
-        <w:t>He already sent his best advice and his worst advice in the intake, and both of them are load-bearing for this episode. The standardized Rapid Fire will spend them in the first two minutes and you do not follow up on Rapid Fire. So after each of those two answers, say "Love it, and we are coming back to that." Then come back to them on purpose: the worst-advice callback is Q9 and the best-advice callback is Q10. They are written out. Do not improvise the callbacks.</w:t>
+        <w:t>He already sent his best advice and his worst advice in the intake, and both of them are load-bearing for this episode. The standardized Rapid Fire will spend them in the first two minutes and you do not follow up on Rapid Fire. Pre-brief him in the green room, sentence 3 on the intro page, then after each of those two answers say "Love it, and we are coming back to that." Then come back to them on purpose: the worst-advice callback is Q9 and the best-advice callback is Q10. They are written out. Do not improvise the callbacks.</w:t>
       </w:r>
     </w:p>
     <w:p>
@@ -526,7 +761,26 @@
           <w:b w:val="0"/>
           <w:i w:val="0"/>
         </w:rPr>
-        <w:t>He has publicly used "1065% more likely to get calls and clicks" for profiles with 100+ photos, and his site uses "10x more client calls," "3 to 5x more profile views," and a client who got $1.2M in listings in two weeks. None of those have a traceable primary source. Separately, his SpeakerFlow bio says 1,200+ five-star reviews across his own Kansas City businesses while LOC8's site says 248+ reviews at 4.9. Those are two different things and stacking them sounds like a contradiction. RULE: let him say his numbers, do not repeat them back, do not put them in the intro, and never say two of them in the same sentence. The only number you say out loud is the 83% no-click figure in Q3, and that one is published research, not his.</w:t>
+        <w:t>He has publicly used "1065% more likely to get calls and clicks" for profiles with 100+ photos, and his site uses "10x more client calls," "3 to 5x more profile views," and a client who got $1.2M in listings in two weeks. None of those have a traceable primary source. Separately, his SpeakerFlow bio says 1,200+ five-star reviews across his own Kansas City businesses while LOC8's site says 248+ reviews at 4.9. Those are two different things and stacking them sounds like a contradiction.</w:t>
+      </w:r>
+    </w:p>
+    <w:p>
+      <w:pPr>
+        <w:spacing w:after="120"/>
+      </w:pPr>
+      <w:r>
+        <w:rPr>
+          <w:b/>
+          <w:i w:val="0"/>
+        </w:rPr>
+        <w:t xml:space="preserve">   THE RULE, and v2 made it precise because v1 was sloppy about it: </w:t>
+      </w:r>
+      <w:r>
+        <w:rPr>
+          <w:b w:val="0"/>
+          <w:i w:val="0"/>
+        </w:rPr>
+        <w:t>Performance claims are banned from your mouth. That is 1065%, 10x, 3 to 5x, and the $1.2M. Let him say them, do not repeat them back, never say two in one sentence, and keep all of them out of the intro, the titles, and the descriptions. Volume claims are fine when they are attributed to him: more than a thousand profiles rebuilt, 160+ markets, US and Canada. Those are consistent across every source of his and they describe what he did, not what it produced. That is why the intro and the YouTube description both carry the thousand. The only research number you assert as fact is in Q3, and it is not his.</w:t>
       </w:r>
     </w:p>
     <w:p>
@@ -764,7 +1018,7 @@
               <w:rPr>
                 <w:sz w:val="19"/>
               </w:rPr>
-              <w:t>83% of Google Searches Now End Without a Click. Bobby Kerr on How Agents Get Picked Anyway.</w:t>
+              <w:t>Google Cites You and Nobody Clicks. Bobby Kerr on Getting Picked Inside the Answer.</w:t>
             </w:r>
           </w:p>
         </w:tc>
@@ -792,7 +1046,7 @@
               <w:rPr>
                 <w:sz w:val="19"/>
               </w:rPr>
-              <w:t>The stat does the search and authority work, and "anyway" holds the curiosity open. The number is published research, not a guest claim, so it survives scrutiny.</w:t>
+              <w:t>Built on the verified Pew finding that a cited source gets clicked about 1% of the time. The threat is in the first four words and the escape is withheld. v1 used the 83% version of this, which is true but is the number every SEO account already posted.</w:t>
             </w:r>
           </w:p>
         </w:tc>
@@ -1195,7 +1449,7 @@
               <w:rPr>
                 <w:sz w:val="19"/>
               </w:rPr>
-              <w:t>22:00 to 32:00</w:t>
+              <w:t>22:00 to 30:00</w:t>
             </w:r>
           </w:p>
         </w:tc>
@@ -1239,7 +1493,7 @@
               <w:rPr>
                 <w:sz w:val="19"/>
               </w:rPr>
-              <w:t>32:00 to 40:00</w:t>
+              <w:t>30:00 to 40:00</w:t>
             </w:r>
           </w:p>
         </w:tc>
@@ -1619,7 +1873,7 @@
           <w:b/>
           <w:i w:val="0"/>
         </w:rPr>
-        <w:t>Here is the number that made me want to have this conversation. When Google puts an AI overview at the top of the page, the research says something like 83 percent of those searches end without a click to anybody's site, and inside AI Mode it is higher than that. If nobody is clicking through, where does an agent actually get chosen now, and what does that change about what you put on the profile?</w:t>
+        <w:t>Here is the number that made me want to have this conversation. Pew looked at what people actually do when Google shows them an AI answer, and they click one of the sources it cites about one percent of the time. One percent. So getting cited is not the win anymore, being the sentence is. What does that change about what an agent puts on the profile?</w:t>
       </w:r>
     </w:p>
     <w:p>
@@ -1638,7 +1892,7 @@
         <w:rPr>
           <w:i/>
         </w:rPr>
-        <w:t>Walk me through it screen by screen. Buyer opens their phone, types the thing, and then what happens until my phone rings?</w:t>
+        <w:t>Walk me through it screen by screen. A buyer opens their phone, types the thing, and then what happens between there and my phone ringing?</w:t>
       </w:r>
     </w:p>
     <w:p>
@@ -1677,6 +1931,25 @@
           <w:i/>
         </w:rPr>
         <w:t>All segments.</w:t>
+      </w:r>
+    </w:p>
+    <w:p>
+      <w:pPr>
+        <w:spacing w:after="40"/>
+      </w:pPr>
+      <w:r>
+        <w:rPr>
+          <w:b/>
+          <w:i w:val="0"/>
+        </w:rPr>
+        <w:t xml:space="preserve">PRODUCER NOTE: </w:t>
+      </w:r>
+      <w:r>
+        <w:rPr>
+          <w:b w:val="0"/>
+          <w:i/>
+        </w:rPr>
+        <w:t>SECOND HALF, ask it as its own question and do not skip it: your pitch says Gemini reads the profile and ChatGPT reads the internet's opinion of you. Those are two different jobs. From what I have seen, ChatGPT leans on Bing Places, Yelp, and Foursquare more than it touches a Google profile at all. So which engine reads what, and what does an agent do about the ones that are not Google? This is the honest version of his own claim and it is the difference between an AI search episode and a Google episode. If he waves it off, that tells you something too.</w:t>
       </w:r>
     </w:p>
     <w:p>
@@ -2201,6 +2474,25 @@
     </w:p>
     <w:p>
       <w:pPr>
+        <w:spacing w:after="40"/>
+      </w:pPr>
+      <w:r>
+        <w:rPr>
+          <w:b/>
+          <w:i w:val="0"/>
+        </w:rPr>
+        <w:t xml:space="preserve">PRODUCER NOTE: </w:t>
+      </w:r>
+      <w:r>
+        <w:rPr>
+          <w:b w:val="0"/>
+          <w:i/>
+        </w:rPr>
+        <w:t>So you can tell whether the answer is right: Google treats agents as individual practitioners, which means the profile name is the person's name and nothing else. Maria Lopez. Not Maria Lopez Realtor, not Maria Lopez Real Estate, not Maria Lopez at Anywhere Realty. Adding any of that is a suspension trigger. The other one is the address. An agent who lists a brokerage address they do not personally staff gets flagged, and the setup most solo agents actually qualify for is a service area business with the street address hidden. If he says all of that, he is the real thing. If he says put your keyword in the name because it helps you rank, that is against Google's own guidelines, and your follow-up is: how many of your clients have been suspended doing that?</w:t>
+      </w:r>
+    </w:p>
+    <w:p>
+      <w:pPr>
         <w:spacing w:after="0"/>
       </w:pPr>
     </w:p>
@@ -2233,7 +2525,7 @@
         <w:pStyle w:val="Heading2"/>
       </w:pPr>
       <w:r>
-        <w:t>BLOCK 3: COMMODITY VS NON-COMMODITY (22:00 to 32:00)</w:t>
+        <w:t>BLOCK 3: COMMODITY VS NON-COMMODITY (22:00 to 30:00)</w:t>
       </w:r>
     </w:p>
     <w:p>
@@ -2246,7 +2538,7 @@
           <w:i/>
           <w:sz w:val="19"/>
         </w:rPr>
-        <w:t>Audience note: this block carries both Rapid Fire callbacks. It is also the most contestable claim in the episode, so it needs the most evidence.</w:t>
+        <w:t>Audience note: this block carries both Rapid Fire callbacks. It is also the most contestable claim in the episode, so it needs the most evidence. v2 cut it from ten minutes to eight and gave them to Block 4. Four questions in eight minutes means you cannot let him run here, and Q12 is the one that goes if he does.</w:t>
       </w:r>
     </w:p>
     <w:p>
@@ -2653,7 +2945,7 @@
         <w:pStyle w:val="Heading2"/>
       </w:pPr>
       <w:r>
-        <w:t>BLOCK 4: REVIEWS AND BEING THE ANSWER (32:00 to 40:00)</w:t>
+        <w:t>BLOCK 4: REVIEWS AND BEING THE ANSWER (30:00 to 40:00)</w:t>
       </w:r>
     </w:p>
     <w:p>
@@ -2666,7 +2958,7 @@
           <w:i/>
           <w:sz w:val="19"/>
         </w:rPr>
-        <w:t>Audience note: the most immediately actionable block in the episode, and the one with the highest chance of producing a screenshot.</w:t>
+        <w:t>Audience note: the most immediately actionable block in the episode, the one with the highest chance of producing a screenshot, and the only block holding two never-cut questions. v1 gave it the tightest clock in the episode, which was backwards. It now gets ten minutes.</w:t>
       </w:r>
     </w:p>
     <w:p>
@@ -3195,7 +3487,7 @@
           <w:b w:val="0"/>
           <w:i/>
         </w:rPr>
-        <w:t>"Here is what I want you to do before the next episode. Open your Google Business Profile, go to the services section, and write out every service you actually offer, named the way a client would say it, with your neighborhoods inside the words. If you have fewer than ten, you have got homework. Not next month. This week."</w:t>
+        <w:t>"Here is what I want you to do before the next episode. Open your Google Business Profile, go to the services section, and write ten services. Not four. Ten. Each one named the way a client would say it out loud, and each one with a neighborhood in it. If you have got four in there right now, you are six short. Not next month. This week."</w:t>
       </w:r>
     </w:p>
     <w:p>
@@ -3208,7 +3500,7 @@
           <w:i/>
           <w:sz w:val="19"/>
         </w:rPr>
-        <w:t>Why this one: it is free, it takes under thirty minutes, done is countable, and it is the exact field Q6 gave them the example copy for. If Q6 produces a better field, swap it, but keep the counting. The counting is what makes it done.</w:t>
+        <w:t>Why this one: it is free, it takes under thirty minutes, and done is a number you can count. v1 said "write out every service you offer, and if you have fewer than ten you have homework," which left the listener unsure whether done meant counting or writing. Ten is the assignment. If Q6 produces a better field than services, swap the field, but keep the number. The number is what makes it done.</w:t>
       </w:r>
     </w:p>
     <w:p>
@@ -3250,7 +3542,7 @@
         <w:t xml:space="preserve">1. Q12, the broker flip. </w:t>
       </w:r>
       <w:r>
-        <w:t>It is the furthest from your largest audience segment, and Block 3 still ends on an implementation question without it.</w:t>
+        <w:t>It is the furthest from your largest audience segment, and Block 3 still ends on an implementation question without it. Block 3 is eight minutes now, so assume you are cutting this one.</w:t>
       </w:r>
     </w:p>
     <w:p>
@@ -3292,10 +3584,23 @@
         <w:rPr>
           <w:b/>
         </w:rPr>
-        <w:t xml:space="preserve">4. Q3. </w:t>
-      </w:r>
-      <w:r>
-        <w:t>Only if the AI framing already came out inside Q2. If it did not, keep it, because the title is built on it.</w:t>
+        <w:t xml:space="preserve">4. Q11, the calendar. </w:t>
+      </w:r>
+      <w:r>
+        <w:t>Only if Q9 already produced the cadence, which happens more often than you would think, because he cannot explain why syndicated content fails without describing what feeding a profile properly looks like.</w:t>
+      </w:r>
+    </w:p>
+    <w:p>
+      <w:pPr>
+        <w:spacing w:after="120"/>
+      </w:pPr>
+      <w:r>
+        <w:rPr>
+          <w:b w:val="0"/>
+          <w:i/>
+          <w:sz w:val="19"/>
+        </w:rPr>
+        <w:t>Q3 came off this list in v2. It is now carrying the verified research and the multi-engine question, which means it is the only place in the episode where the phrase AI search gets tested instead of assumed.</w:t>
       </w:r>
     </w:p>
     <w:p>
@@ -3334,6 +3639,21 @@
       </w:r>
       <w:r>
         <w:t>The Q and A change. This is the only minute of this episode that could not have been recorded two years ago.</w:t>
+      </w:r>
+    </w:p>
+    <w:p>
+      <w:pPr>
+        <w:pStyle w:val="ListBullet"/>
+        <w:spacing w:after="40"/>
+      </w:pPr>
+      <w:r>
+        <w:rPr>
+          <w:b/>
+        </w:rPr>
+        <w:t xml:space="preserve">Q10. </w:t>
+      </w:r>
+      <w:r>
+        <w:t>The best-advice callback. Added in v2. Rapid Fire spends his best story in minute one, and this is the only thing in the run of show that buys it back. v1 called the callbacks load-bearing and then left both of them cuttable.</w:t>
       </w:r>
     </w:p>
     <w:p>
@@ -4288,7 +4608,7 @@
               <w:rPr>
                 <w:sz w:val="19"/>
               </w:rPr>
-              <w:t>83% of searches with an AI overview end with no click, 93% in AI Mode</w:t>
+              <w:t>People click a cited source about 1% of the time when an AI Overview is shown, and click through on 8% of those searches versus 15% without one</w:t>
             </w:r>
           </w:p>
         </w:tc>
@@ -4302,7 +4622,7 @@
               <w:rPr>
                 <w:sz w:val="19"/>
               </w:rPr>
-              <w:t>Published 2026 research reported in real estate trade coverage</w:t>
+              <w:t>Pew Research behavioral tracking</w:t>
             </w:r>
           </w:p>
         </w:tc>
@@ -4316,7 +4636,95 @@
               <w:rPr>
                 <w:sz w:val="19"/>
               </w:rPr>
-              <w:t>Medium to high. This is the one number you say on air.</w:t>
+              <w:t>High. Verified in the v2 pass. This is the number you say on air, and it is now the basis for Q3.</w:t>
+            </w:r>
+          </w:p>
+        </w:tc>
+      </w:tr>
+      <w:tr>
+        <w:tc>
+          <w:tcPr>
+            <w:tcW w:type="dxa" w:w="4176"/>
+          </w:tcPr>
+          <w:p>
+            <w:r/>
+            <w:r>
+              <w:rPr>
+                <w:sz w:val="19"/>
+              </w:rPr>
+              <w:t>83% of searches with an AI Overview end with no click, 93% inside AI Mode</w:t>
+            </w:r>
+          </w:p>
+        </w:tc>
+        <w:tc>
+          <w:tcPr>
+            <w:tcW w:type="dxa" w:w="3456"/>
+          </w:tcPr>
+          <w:p>
+            <w:r/>
+            <w:r>
+              <w:rPr>
+                <w:sz w:val="19"/>
+              </w:rPr>
+              <w:t>Seer Interactive; AI Mode figure via Semrush, Sept 2025</w:t>
+            </w:r>
+          </w:p>
+        </w:tc>
+        <w:tc>
+          <w:tcPr>
+            <w:tcW w:type="dxa" w:w="2304"/>
+          </w:tcPr>
+          <w:p>
+            <w:r/>
+            <w:r>
+              <w:rPr>
+                <w:sz w:val="19"/>
+              </w:rPr>
+              <w:t>Medium to high. Safe to say, but the Pew number is sharper and lands harder.</w:t>
+            </w:r>
+          </w:p>
+        </w:tc>
+      </w:tr>
+      <w:tr>
+        <w:tc>
+          <w:tcPr>
+            <w:tcW w:type="dxa" w:w="4176"/>
+          </w:tcPr>
+          <w:p>
+            <w:r/>
+            <w:r>
+              <w:rPr>
+                <w:sz w:val="19"/>
+              </w:rPr>
+              <w:t>68% of all US Google searches end without a click</w:t>
+            </w:r>
+          </w:p>
+        </w:tc>
+        <w:tc>
+          <w:tcPr>
+            <w:tcW w:type="dxa" w:w="3456"/>
+          </w:tcPr>
+          <w:p>
+            <w:r/>
+            <w:r>
+              <w:rPr>
+                <w:sz w:val="19"/>
+              </w:rPr>
+              <w:t>SparkToro and Similarweb, 2026</w:t>
+            </w:r>
+          </w:p>
+        </w:tc>
+        <w:tc>
+          <w:tcPr>
+            <w:tcW w:type="dxa" w:w="2304"/>
+          </w:tcPr>
+          <w:p>
+            <w:r/>
+            <w:r>
+              <w:rPr>
+                <w:sz w:val="19"/>
+              </w:rPr>
+              <w:t>High. Useful for context if he asks where the number comes from.</w:t>
             </w:r>
           </w:p>
         </w:tc>
@@ -4910,7 +5318,7 @@
           <w:b w:val="0"/>
           <w:i w:val="0"/>
         </w:rPr>
-        <w:t>Bobby Kerr, founder of LOC8 My Business, has optimized Google Business Profiles for more than 1,000 real estate agents across the US and Canada. On this episode of the Keeping It Real Podcast, he walks D.J. Paris through what a complete profile actually looks like field by field, why the text inside a review beats the star count, what changed when Google removed the Q and A section, and how agents get cited by AI search engines. Google Business Profile optimization, local SEO, and AI search visibility for realtors.</w:t>
+        <w:t>Bobby Kerr, founder of LOC8 My Business, has optimized Google Business Profiles for more than 1,000 real estate agents across the US and Canada. On this episode of the Keeping It Real Podcast, he walks D.J. Paris through what a complete profile actually looks like field by field, why the text inside a review beats the star count, what changed when Google removed the Q and A section, and which AI engines actually read a Google profile versus which ones do not. Google Business Profile optimization, local SEO, and AI search visibility for realtors.</w:t>
       </w:r>
     </w:p>
     <w:p>
@@ -5009,7 +5417,7 @@
           <w:i/>
           <w:sz w:val="19"/>
         </w:rPr>
-        <w:t>Estimates. Adjust after recording. Each title is written to be searchable on its own.</w:t>
+        <w:t>Estimates. Adjust after recording. Each title is written to be searchable on its own. Retimed in v2 for the Block 3 and Block 4 rebalance. If you use the cut list, the 29:00 and 40:00 chapters are the two that disappear, so delete those rows rather than stretching the ones around them.</w:t>
       </w:r>
     </w:p>
     <w:tbl>
@@ -5199,7 +5607,7 @@
               <w:rPr>
                 <w:sz w:val="19"/>
               </w:rPr>
-              <w:t>83% of AI Searches End With No Click. So Where Do Agents Get Chosen?</w:t>
+              <w:t>People Click a Cited Source 1% of the Time. So How Do Agents Get Chosen?</w:t>
             </w:r>
           </w:p>
         </w:tc>
@@ -5395,7 +5803,7 @@
               <w:rPr>
                 <w:sz w:val="19"/>
               </w:rPr>
-              <w:t>25:30</w:t>
+              <w:t>25:00</w:t>
             </w:r>
           </w:p>
         </w:tc>
@@ -5425,7 +5833,7 @@
               <w:rPr>
                 <w:sz w:val="19"/>
               </w:rPr>
-              <w:t>28:00</w:t>
+              <w:t>27:30</w:t>
             </w:r>
           </w:p>
         </w:tc>
@@ -5455,7 +5863,7 @@
               <w:rPr>
                 <w:sz w:val="19"/>
               </w:rPr>
-              <w:t>30:30</w:t>
+              <w:t>29:00</w:t>
             </w:r>
           </w:p>
         </w:tc>
@@ -5485,7 +5893,7 @@
               <w:rPr>
                 <w:sz w:val="19"/>
               </w:rPr>
-              <w:t>32:00</w:t>
+              <w:t>30:00</w:t>
             </w:r>
           </w:p>
         </w:tc>
@@ -5515,7 +5923,7 @@
               <w:rPr>
                 <w:sz w:val="19"/>
               </w:rPr>
-              <w:t>35:00</w:t>
+              <w:t>33:30</w:t>
             </w:r>
           </w:p>
         </w:tc>
@@ -5545,7 +5953,7 @@
               <w:rPr>
                 <w:sz w:val="19"/>
               </w:rPr>
-              <w:t>37:30</w:t>
+              <w:t>36:30</w:t>
             </w:r>
           </w:p>
         </w:tc>
@@ -5575,7 +5983,7 @@
               <w:rPr>
                 <w:sz w:val="19"/>
               </w:rPr>
-              <w:t>39:00</w:t>
+              <w:t>38:30</w:t>
             </w:r>
           </w:p>
         </w:tc>
@@ -5667,10 +6075,15 @@
     </w:p>
     <w:p>
       <w:pPr>
-        <w:pStyle w:val="Heading1"/>
-      </w:pPr>
-      <w:r>
-        <w:t>SECTION 7: STRESS TEST, COUNCIL REVIEW &amp; EP POLISH</w:t>
+        <w:spacing w:after="120"/>
+      </w:pPr>
+      <w:r>
+        <w:rPr>
+          <w:b w:val="0"/>
+          <w:i/>
+          <w:sz w:val="19"/>
+        </w:rPr>
+        <w:t>This is the record of the second full round. v1 shipped after its own three passes; this section is what a fresh attack found in that finished document, what the council said on the re-run, and what actually changed. Rows here describe fixes that are visible in this document, not suggestions.</w:t>
       </w:r>
     </w:p>
     <w:p>
@@ -5678,7 +6091,7 @@
         <w:pStyle w:val="Heading2"/>
       </w:pPr>
       <w:r>
-        <w:t>7A. Stress Test</w:t>
+        <w:t>7A. Stress Test, round two</w:t>
       </w:r>
     </w:p>
     <w:tbl>
@@ -5719,7 +6132,7 @@
                 <w:b/>
                 <w:sz w:val="19"/>
               </w:rPr>
-              <w:t>What broke</w:t>
+              <w:t>What broke in v1</w:t>
             </w:r>
           </w:p>
         </w:tc>
@@ -5734,7 +6147,7 @@
                 <w:b/>
                 <w:sz w:val="19"/>
               </w:rPr>
-              <w:t>Fix applied</w:t>
+              <w:t>Fix applied in v2</w:t>
             </w:r>
           </w:p>
         </w:tc>
@@ -5764,7 +6177,7 @@
               <w:rPr>
                 <w:sz w:val="19"/>
               </w:rPr>
-              <w:t>His resume has two published versions and the intake adds a third. The first draft opened on his origin story, which meant D.J. would have had to assert a career path nobody can verify.</w:t>
+              <w:t>THE BIG ONE. v1 instructed D.J. to say 83% on air and called it the one number he could assert. That figure came out of a search summary. The underlying article returned a 403 and was never actually opened, so the document was telling the host to state a number nobody had verified. This is the exact failure the research rules exist to prevent, and v1 committed it while lecturing the guest about unsourced stats.</w:t>
             </w:r>
           </w:p>
         </w:tc>
@@ -5778,7 +6191,7 @@
               <w:rPr>
                 <w:sz w:val="19"/>
               </w:rPr>
-              <w:t>Q1 was rebuilt on a client result instead of his background, and the intro carries no business list. Landmine 2 gives the one safe way to get the resume on tape, which is to let him say it.</w:t>
+              <w:t>Verified in the v2 pass. It holds: 83% for AI Overviews via Seer Interactive, 93% inside AI Mode via Semrush. But the check surfaced a better number. Pew tracked real behavior and found a cited source gets clicked about 1% of the time. Q3 was rebuilt on it, title 2 was rebuilt on it, and 4D now carries all three figures with their actual sources.</w:t>
             </w:r>
           </w:p>
         </w:tc>
@@ -5808,7 +6221,7 @@
               <w:rPr>
                 <w:sz w:val="19"/>
               </w:rPr>
-              <w:t>Name collision. The most-searched Bobby Kerr is an Irish entrepreneur and broadcaster. Any AI-assisted intro will contaminate.</w:t>
+              <w:t>The episode was titled around AI search and only ever interrogated Google. His own pitch says Gemini reads the profile and ChatGPT reads the internet's opinion of you, and v1 knew from research that ChatGPT leans on Bing Places, Yelp, and Foursquare rather than reading a Google profile at all. That finding was parked in a research-brief footnote marked useful if he overclaims.</w:t>
             </w:r>
           </w:p>
         </w:tc>
@@ -5822,7 +6235,7 @@
               <w:rPr>
                 <w:sz w:val="19"/>
               </w:rPr>
-              <w:t>Landmine 1 added, with the three phrases never to say.</w:t>
+              <w:t>It is now the second half of Q3, written out as its own question with an instruction not to skip it. If his answer is thin, that is a real finding about the depth of his system, and D.J. can hear it in real time.</w:t>
             </w:r>
           </w:p>
         </w:tc>
@@ -5852,7 +6265,7 @@
               <w:rPr>
                 <w:sz w:val="19"/>
               </w:rPr>
-              <w:t>Unverifiable stats everywhere. 1065%, 10x calls, 3 to 5x views, $1.2M in two weeks, and two different review counts that read as a contradiction.</w:t>
+              <w:t>There was no intro. v1 referenced the intro four times across the landmines, telling D.J. what not to put in it, and never wrote one. The document policed a thing it had not supplied.</w:t>
             </w:r>
           </w:p>
         </w:tc>
@@ -5866,7 +6279,7 @@
               <w:rPr>
                 <w:sz w:val="19"/>
               </w:rPr>
-              <w:t>Landmine 5 sets the rule: let him say them, never repeat them, never stack two. 4D marks each one. No guest-supplied number appears in the cold open, the titles, or the live descriptions. The only number D.J. says is the 83% figure, which is published research.</w:t>
+              <w:t>Written, on its own page, engineered around every landmine, including a line that gets his contested resume on tape in his own voice instead of D.J.'s.</w:t>
             </w:r>
           </w:p>
         </w:tc>
@@ -5896,7 +6309,7 @@
               <w:rPr>
                 <w:sz w:val="19"/>
               </w:rPr>
-              <w:t>Rapid Fire spends both of the questions this episode is built on, and D.J. does not follow up on Rapid Fire.</w:t>
+              <w:t>No green room brief. The single biggest structural problem with this guest is that Rapid Fire spends both of his best stories in minute one, and v1 tried to solve it entirely with an in-the-moment holding line.</w:t>
             </w:r>
           </w:p>
         </w:tc>
@@ -5910,7 +6323,7 @@
               <w:rPr>
                 <w:sz w:val="19"/>
               </w:rPr>
-              <w:t>Watch Out For note on page 1 with the exact holding line, plus two written callbacks at Q9 and Q10 so the recovery is not improvised.</w:t>
+              <w:t>Three green-room sentences added. The third one pre-briefs him that the callbacks are coming, which turns Q9 and Q10 from repetition into a return.</w:t>
             </w:r>
           </w:p>
         </w:tc>
@@ -5940,7 +6353,7 @@
               <w:rPr>
                 <w:sz w:val="19"/>
               </w:rPr>
-              <w:t>Drift risk: this becomes a product demo. He sells a build, a done-for-you, and a monthly membership, and every question in Block 2 has a price tag attached to the honest answer.</w:t>
+              <w:t>Clock allocation was backwards. Block 4 held two of the five never-cut questions and had the tightest window in the episode at eight minutes for four questions. Block 3, the block the council already wanted shortened, had ten.</w:t>
             </w:r>
           </w:p>
         </w:tc>
@@ -5954,7 +6367,7 @@
               <w:rPr>
                 <w:sz w:val="19"/>
               </w:rPr>
-              <w:t>Product cap stated on page 1, plus producer notes on Q6 and Q11 that force the do-it-yourself version after he names the product once.</w:t>
+              <w:t>Block 3 is now 22:00 to 30:00 and Block 4 is 30:00 to 40:00. Chapter markers retimed to match.</w:t>
             </w:r>
           </w:p>
         </w:tc>
@@ -5984,7 +6397,7 @@
               <w:rPr>
                 <w:sz w:val="19"/>
               </w:rPr>
-              <w:t>Q9 as drafted was dodgeable. Google can tell the difference between original and copied content is a belief statement he can answer with a story.</w:t>
+              <w:t>Internal contradiction. Page 1 called the two Rapid Fire callbacks load-bearing, then the never-cut list contained neither of them, which meant the document told D.J. both that he had to do them and that he could drop them.</w:t>
             </w:r>
           </w:p>
         </w:tc>
@@ -5998,7 +6411,7 @@
               <w:rPr>
                 <w:sz w:val="19"/>
               </w:rPr>
-              <w:t>Rewritten to demand an observed before and after at ninety days, with a producer note telling D.J. not to rescue him if he cannot produce one.</w:t>
+              <w:t>Q10 added to never-cut, with the reason written next to it. Q9 stays cuttable on purpose, because its value depends on him producing evidence he may not have.</w:t>
             </w:r>
           </w:p>
         </w:tc>
@@ -6028,7 +6441,7 @@
               <w:rPr>
                 <w:sz w:val="19"/>
               </w:rPr>
-              <w:t>Gotcha risk on the Q and A question. As first written it read as an ambush, and ambushing a first-time guest in minute eighteen kills the second half of the interview.</w:t>
+              <w:t>The stat rule contradicted itself. Landmine 5 banned guest-supplied numbers from the descriptions, and then the YouTube description said more than 1,000 agents.</w:t>
             </w:r>
           </w:p>
         </w:tc>
@@ -6042,7 +6455,7 @@
               <w:rPr>
                 <w:sz w:val="19"/>
               </w:rPr>
-              <w:t>Q7 reframed as two practitioners comparing notes, with the exact recovery line written out and a landmine that forbids fact-checking him on air.</w:t>
+              <w:t>The rule now separates performance claims, which stay banned, from volume claims, which are fine when attributed. The thousand describes what he did. The 10x describes what it supposedly produced. Only one of those is safe.</w:t>
             </w:r>
           </w:p>
         </w:tc>
@@ -6072,7 +6485,7 @@
               <w:rPr>
                 <w:sz w:val="19"/>
               </w:rPr>
-              <w:t>Runtime. The draft ran nineteen questions plus Rapid Fire against a 43 minute target with a guest who teaches webinars for a living.</w:t>
+              <w:t>The homework did not define done. Write out every service you offer, and if you have fewer than ten you have homework, leaves the listener unsure whether the assignment is counting or writing.</w:t>
             </w:r>
           </w:p>
         </w:tc>
@@ -6086,7 +6499,7 @@
               <w:rPr>
                 <w:sz w:val="19"/>
               </w:rPr>
-              <w:t>Cut to sixteen plus one optional human landing. Cut list and never-cut list written.</w:t>
+              <w:t>Rewritten to a flat number. Write ten, each with a neighborhood in it. Counting is the check, not the task.</w:t>
             </w:r>
           </w:p>
         </w:tc>
@@ -6116,7 +6529,7 @@
               <w:rPr>
                 <w:sz w:val="19"/>
               </w:rPr>
-              <w:t>Sponsor exposure. His thesis is that the free page beats the paid website, and two sponsors sell in that neighborhood.</w:t>
+              <w:t>Q8 asked the suspension question without arming D.J. with the answer, so a wrong answer would have gone straight to air unchallenged on the one topic in this episode that can actually cost a listener their profile.</w:t>
             </w:r>
           </w:p>
         </w:tc>
@@ -6130,7 +6543,7 @@
               <w:rPr>
                 <w:sz w:val="19"/>
               </w:rPr>
-              <w:t>Landmine 6, and the second half of Q2 makes him name what a website still does. That sentence is what makes the clip safe to ship.</w:t>
+              <w:t>Producer note now carries Google's actual rules: practitioner name only, no keyword in the name, and service-area setup with the address hidden for agents who do not staff the brokerage office. Plus the follow-up to use if he recommends the thing that gets people suspended.</w:t>
             </w:r>
           </w:p>
         </w:tc>
@@ -6160,7 +6573,7 @@
               <w:rPr>
                 <w:sz w:val="19"/>
               </w:rPr>
-              <w:t>A death in one of his intake stories, with a first name and a room full of identifiable professionals.</w:t>
+              <w:t>Q3 sat on the cut list while carrying the episode's central premise.</w:t>
             </w:r>
           </w:p>
         </w:tc>
@@ -6174,7 +6587,7 @@
               <w:rPr>
                 <w:sz w:val="19"/>
               </w:rPr>
-              <w:t>Landmine 7. It is deliberately not in the run of show, with hard rules if he raises it and a written line to land it.</w:t>
+              <w:t>Off the cut list. Q11 took its place, with the reason: the cadence usually falls out of Q9 anyway.</w:t>
             </w:r>
           </w:p>
         </w:tc>
@@ -6190,7 +6603,20 @@
         <w:pStyle w:val="Heading2"/>
       </w:pPr>
       <w:r>
-        <w:t>7B. Council Review</w:t>
+        <w:t>7B. Council Review, re-run on v2</w:t>
+      </w:r>
+    </w:p>
+    <w:p>
+      <w:pPr>
+        <w:spacing w:after="120"/>
+      </w:pPr>
+      <w:r>
+        <w:rPr>
+          <w:b w:val="0"/>
+          <w:i/>
+          <w:sz w:val="19"/>
+        </w:rPr>
+        <w:t>The board was reconvened on the rebuilt document. Members who signed off on v1 without changes are not repeated here.</w:t>
       </w:r>
     </w:p>
     <w:p>
@@ -6268,7 +6694,97 @@
               <w:rPr>
                 <w:sz w:val="19"/>
               </w:rPr>
-              <w:t>Block 2 is the whole product. Q5 and Q6 are where an agent gets paid for listening. Every other question should be measured against whether it earns its ten minutes next to those two.</w:t>
+              <w:t>The dissent is resolved and I will take the trade. Block 3 loses two minutes, Block 4 gains them, and the block with the screenshot question finally has room to breathe. I still think Q9 is the softest question in the episode. The difference now is that if it collapses, it collapses inside eight minutes instead of ten.</w:t>
+            </w:r>
+          </w:p>
+        </w:tc>
+      </w:tr>
+      <w:tr>
+        <w:tc>
+          <w:tcPr>
+            <w:tcW w:type="dxa" w:w="2016"/>
+          </w:tcPr>
+          <w:p>
+            <w:r/>
+            <w:r>
+              <w:rPr>
+                <w:sz w:val="19"/>
+              </w:rPr>
+              <w:t>Brendan Kane</w:t>
+            </w:r>
+          </w:p>
+        </w:tc>
+        <w:tc>
+          <w:tcPr>
+            <w:tcW w:type="dxa" w:w="7920"/>
+          </w:tcPr>
+          <w:p>
+            <w:r/>
+            <w:r>
+              <w:rPr>
+                <w:sz w:val="19"/>
+              </w:rPr>
+              <w:t>Title 2 got better because you stopped reaching for the number everybody else already posted. 83% is on every SEO account in the country. One percent is the same finding with a knife on it. That is the variant.</w:t>
+            </w:r>
+          </w:p>
+        </w:tc>
+      </w:tr>
+      <w:tr>
+        <w:tc>
+          <w:tcPr>
+            <w:tcW w:type="dxa" w:w="2016"/>
+          </w:tcPr>
+          <w:p>
+            <w:r/>
+            <w:r>
+              <w:rPr>
+                <w:sz w:val="19"/>
+              </w:rPr>
+              <w:t>Chip and Dan Heath</w:t>
+            </w:r>
+          </w:p>
+        </w:tc>
+        <w:tc>
+          <w:tcPr>
+            <w:tcW w:type="dxa" w:w="7920"/>
+          </w:tcPr>
+          <w:p>
+            <w:r/>
+            <w:r>
+              <w:rPr>
+                <w:sz w:val="19"/>
+              </w:rPr>
+              <w:t>One percent beats 83% on the mechanism, not just the drama. 83% tells the listener that people do not click, which they already suspect. One percent tells them the thing they were working toward, getting cited, does not pay, which they do not suspect at all. That is a gap opening, not a fact landing.</w:t>
+            </w:r>
+          </w:p>
+        </w:tc>
+      </w:tr>
+      <w:tr>
+        <w:tc>
+          <w:tcPr>
+            <w:tcW w:type="dxa" w:w="2016"/>
+          </w:tcPr>
+          <w:p>
+            <w:r/>
+            <w:r>
+              <w:rPr>
+                <w:sz w:val="19"/>
+              </w:rPr>
+              <w:t>Byron Lazine</w:t>
+            </w:r>
+          </w:p>
+        </w:tc>
+        <w:tc>
+          <w:tcPr>
+            <w:tcW w:type="dxa" w:w="7920"/>
+          </w:tcPr>
+          <w:p>
+            <w:r/>
+            <w:r>
+              <w:rPr>
+                <w:sz w:val="19"/>
+              </w:rPr>
+              <w:t>Now the AI part of this episode has a second engine in it. Every real estate show this year has done Google and AI. Almost none of them have said out loud that ChatGPT is mostly not reading your Google profile. If he confirms that, that is the take and it belongs in the clip pile.</w:t>
             </w:r>
           </w:p>
         </w:tc>
@@ -6298,37 +6814,7 @@
               <w:rPr>
                 <w:sz w:val="19"/>
               </w:rPr>
-              <w:t>The sag is minute twenty-two, right when the build finishes and the content talk starts. That bridge has to re-hook, not summarize. Make it accuse the listener of something.</w:t>
-            </w:r>
-          </w:p>
-        </w:tc>
-      </w:tr>
-      <w:tr>
-        <w:tc>
-          <w:tcPr>
-            <w:tcW w:type="dxa" w:w="2016"/>
-          </w:tcPr>
-          <w:p>
-            <w:r/>
-            <w:r>
-              <w:rPr>
-                <w:sz w:val="19"/>
-              </w:rPr>
-              <w:t>Brendan Kane</w:t>
-            </w:r>
-          </w:p>
-        </w:tc>
-        <w:tc>
-          <w:tcPr>
-            <w:tcW w:type="dxa" w:w="7920"/>
-          </w:tcPr>
-          <w:p>
-            <w:r/>
-            <w:r>
-              <w:rPr>
-                <w:sz w:val="19"/>
-              </w:rPr>
-              <w:t>Title 1 is the insight device, title 2 is the stat device. Run both, they are not competing for the same click. But three of your first four titles started with a number, which means you were reaching for the same ingredient twice.</w:t>
+              <w:t>The intro page is the fix I did not ask for and needed. v1 opened cold on a bio the host had been told he could not state. Now the first ninety seconds are scripted and the guest fills in the risky part himself.</w:t>
             </w:r>
           </w:p>
         </w:tc>
@@ -6358,7 +6844,7 @@
               <w:rPr>
                 <w:sz w:val="19"/>
               </w:rPr>
-              <w:t>The hero is the agent with the blank profile, not the guy with the agency. Half the draft titles named his company. None of them do now. Grunt test on title 1: ranking is over, be the answer instead. Passes.</w:t>
+              <w:t>The homework got clearer and the homework is the promise. Write ten is a thing a person does. Write out every service you offer is a thing a person means to do.</w:t>
             </w:r>
           </w:p>
         </w:tc>
@@ -6374,7 +6860,7 @@
               <w:rPr>
                 <w:sz w:val="19"/>
               </w:rPr>
-              <w:t>Byron Lazine</w:t>
+              <w:t>Jon Youshaei</w:t>
             </w:r>
           </w:p>
         </w:tc>
@@ -6388,7 +6874,7 @@
               <w:rPr>
                 <w:sz w:val="19"/>
               </w:rPr>
-              <w:t>The Q and A removal is the take. That is a real change with a real date on it, and it is the only thing in this episode a competitor show has not already run. Do not bury it at minute eighteen without flagging it in the description.</w:t>
+              <w:t>You retimed the chapters, which most people would have skipped. Add the note about which rows die when the cut list is used, because a chapter marker pointing at a question that never got asked is worse than no chapter at all.</w:t>
             </w:r>
           </w:p>
         </w:tc>
@@ -6418,67 +6904,7 @@
               <w:rPr>
                 <w:sz w:val="19"/>
               </w:rPr>
-              <w:t>Do not break the format for the Bob Jovi story. It is charming and it is not the episode. Keep it optional, keep it last, cut it before you cut the homework.</w:t>
-            </w:r>
-          </w:p>
-        </w:tc>
-      </w:tr>
-      <w:tr>
-        <w:tc>
-          <w:tcPr>
-            <w:tcW w:type="dxa" w:w="2016"/>
-          </w:tcPr>
-          <w:p>
-            <w:r/>
-            <w:r>
-              <w:rPr>
-                <w:sz w:val="19"/>
-              </w:rPr>
-              <w:t>Jon Youshaei</w:t>
-            </w:r>
-          </w:p>
-        </w:tc>
-        <w:tc>
-          <w:tcPr>
-            <w:tcW w:type="dxa" w:w="7920"/>
-          </w:tcPr>
-          <w:p>
-            <w:r/>
-            <w:r>
-              <w:rPr>
-                <w:sz w:val="19"/>
-              </w:rPr>
-              <w:t>Every chapter title has to sell alone. Optimize Your Profile is not a chapter. How Real Estate Agents Get Their Google Profile Suspended is a chapter. Fix all twenty or fix none.</w:t>
-            </w:r>
-          </w:p>
-        </w:tc>
-      </w:tr>
-      <w:tr>
-        <w:tc>
-          <w:tcPr>
-            <w:tcW w:type="dxa" w:w="2016"/>
-          </w:tcPr>
-          <w:p>
-            <w:r/>
-            <w:r>
-              <w:rPr>
-                <w:sz w:val="19"/>
-              </w:rPr>
-              <w:t>Chris Do</w:t>
-            </w:r>
-          </w:p>
-        </w:tc>
-        <w:tc>
-          <w:tcPr>
-            <w:tcW w:type="dxa" w:w="7920"/>
-          </w:tcPr>
-          <w:p>
-            <w:r/>
-            <w:r>
-              <w:rPr>
-                <w:sz w:val="19"/>
-              </w:rPr>
-              <w:t>Q9 costs him something to answer honestly and Q17a costs him something to answer at all. Those are the only two places in this episode where he is a person instead of a system. Protect both.</w:t>
+              <w:t>Two rounds in, the format survived. Standardized Rapid Fire intact, four blocks, bridges written, homework at the end. The green-room brief is a format improvement worth carrying to every guest who pre-sends their advice answers, not just this one.</w:t>
             </w:r>
           </w:p>
         </w:tc>
@@ -6506,10 +6932,10 @@
         <w:rPr>
           <w:b/>
         </w:rPr>
-        <w:t xml:space="preserve">Chip and Dan Heath, on the curiosity claim: </w:t>
-      </w:r>
-      <w:r>
-        <w:t>Title 1 opens the gap before it closes it. Ranking is over is the huh, being handed to the buyer is the aha, and the mechanism stays behind the click. The rejected draft, The Google Business Profile Checklist for Realtors, front-loaded the punchline and left nothing to find out. Curse of knowledge check: the cold open assumes the listener knows what a Google Business Profile is, which is fair, and assumes nothing about who Bobby Kerr is, which is required, because he is not a name your audience recognizes yet.</w:t>
+        <w:t xml:space="preserve">Jonah Berger, re-called on the share claim: </w:t>
+      </w:r>
+      <w:r>
+        <w:t>The share driver moved. In v1 it was Q14, the review script, which is social currency. It is now split, because one percent is an anxiety number with a specific target: the agent who has been doing SEO correctly and is about to learn that correct is no longer the same as chosen. That is high arousal and it has a villain. Valuable virality check on the new framing: retell it as "getting cited is not the win, being the sentence is," and it survives the retelling intact. Q14 is still the screenshot. Q3 is now the argument.</w:t>
       </w:r>
     </w:p>
     <w:p>
@@ -6521,10 +6947,10 @@
         <w:rPr>
           <w:b/>
         </w:rPr>
-        <w:t xml:space="preserve">Jonah Berger, on the sharing claim: </w:t>
-      </w:r>
-      <w:r>
-        <w:t>The arousal here is anxiety, not awe. An agent hears 83% no click and feels behind, which shares well and converts to the homework. Social currency is in Q14: the agent who forwards the review-ask script looks like the one who found it. Valuable virality check: retell the takeaway in one sentence, "reviews should say the neighborhood and the problem you solved, not just five stars," and the point survives intact. That is the clip.</w:t>
+        <w:t xml:space="preserve">Chip and Dan Heath, on the curse of knowledge in the new intro: </w:t>
+      </w:r>
+      <w:r>
+        <w:t>The intro assumes the listener knows what a Google Business Profile is and assumes nothing about who Bobby Kerr is. Correct on both. The phrase every agent has and almost nobody has finished does the whole job in nine words, because it makes the listener check their own profile mentally before the guest has said a word.</w:t>
       </w:r>
     </w:p>
     <w:p>
@@ -6532,7 +6958,7 @@
         <w:pStyle w:val="Heading3"/>
       </w:pPr>
       <w:r>
-        <w:t>Title (pick one to run, keep the others to A/B)</w:t>
+        <w:t>Title (unchanged recommendation, sharpened runner-up)</w:t>
       </w:r>
     </w:p>
     <w:tbl>
@@ -6692,7 +7118,7 @@
               <w:rPr>
                 <w:sz w:val="19"/>
               </w:rPr>
-              <w:t>83% of Google Searches Now End Without a Click. Bobby Kerr on How Agents Get Picked Anyway.</w:t>
+              <w:t>Google Cites You and Nobody Clicks. Bobby Kerr on Getting Picked Inside the Answer.</w:t>
             </w:r>
           </w:p>
         </w:tc>
@@ -6706,7 +7132,7 @@
               <w:rPr>
                 <w:sz w:val="19"/>
               </w:rPr>
-              <w:t>Stat</w:t>
+              <w:t>Stat, rebuilt in v2</w:t>
             </w:r>
           </w:p>
         </w:tc>
@@ -6720,7 +7146,7 @@
               <w:rPr>
                 <w:sz w:val="19"/>
               </w:rPr>
-              <w:t>The number creates the threat, anyway promises the escape and does not describe it.</w:t>
+              <w:t>Names a win the listener is chasing and reveals it does not pay, before offering the replacement.</w:t>
             </w:r>
           </w:p>
         </w:tc>
@@ -6778,7 +7204,7 @@
               <w:rPr>
                 <w:sz w:val="19"/>
               </w:rPr>
-              <w:t>Second person accusation. Strongest emotionally, weakest cold, because front door means nothing until he explains it.</w:t>
+              <w:t>Second person accusation. Strongest emotionally, weakest cold.</w:t>
             </w:r>
           </w:p>
         </w:tc>
@@ -6798,7 +7224,7 @@
           <w:b w:val="0"/>
           <w:i/>
         </w:rPr>
-        <w:t>Recommended: #1 for the podcast feed and the social cuts, #2 for YouTube. They use different ingredients so they are a real A/B rather than two versions of one idea. Goal on this episode is reach, not the guest relationship, because he is a vendor and a first-timer with no audience overlap to protect.</w:t>
+        <w:t>Recommended: still #1 for the feed and the social cuts, #2 for YouTube. The pairing is stronger in v2 because #2 stopped being a louder version of #1 and became a different argument.</w:t>
       </w:r>
     </w:p>
     <w:p>
@@ -6806,40 +7232,7 @@
         <w:pStyle w:val="Heading3"/>
       </w:pPr>
       <w:r>
-        <w:t>Cold-Open Hook (sharpened)</w:t>
-      </w:r>
-    </w:p>
-    <w:p>
-      <w:pPr>
-        <w:spacing w:after="120"/>
-      </w:pPr>
-      <w:r>
-        <w:rPr>
-          <w:b w:val="0"/>
-          <w:i/>
-        </w:rPr>
-        <w:t>"My guest today says the most valuable piece of real estate you own is not a listing, it is a free page on Google you probably have not opened since the day you claimed it. He has rebuilt more than a thousand of them for agents, and he says the ones winning right now are not ranking higher, they are getting handed to the buyer as the answer. We are going to talk about that today. Stay tuned."</w:t>
-      </w:r>
-    </w:p>
-    <w:p>
-      <w:pPr>
-        <w:spacing w:after="120"/>
-      </w:pPr>
-      <w:r>
-        <w:rPr>
-          <w:b w:val="0"/>
-          <w:i/>
-          <w:sz w:val="19"/>
-        </w:rPr>
-        <w:t>Changed from the draft: the draft said 1,000 profiles and 10x more calls in the same breath. The 10x is unverified and it made the whole open sound like an ad. It is gone. The gap now closes on the phrase handed to the buyer as the answer, which is also the title.</w:t>
-      </w:r>
-    </w:p>
-    <w:p>
-      <w:pPr>
-        <w:pStyle w:val="Heading3"/>
-      </w:pPr>
-      <w:r>
-        <w:t>The Clip Engine</w:t>
+        <w:t>The Clip Engine (updated)</w:t>
       </w:r>
     </w:p>
     <w:tbl>
@@ -6927,6 +7320,64 @@
               <w:rPr>
                 <w:sz w:val="19"/>
               </w:rPr>
+              <w:t>3</w:t>
+            </w:r>
+          </w:p>
+        </w:tc>
+        <w:tc>
+          <w:tcPr>
+            <w:tcW w:type="dxa" w:w="3744"/>
+          </w:tcPr>
+          <w:p>
+            <w:r/>
+            <w:r>
+              <w:rPr>
+                <w:sz w:val="19"/>
+              </w:rPr>
+              <w:t>A cited source gets clicked one percent of the time, so what does an agent actually put on the profile? Plus: which AI engines read a Google profile and which ones do not?</w:t>
+            </w:r>
+          </w:p>
+        </w:tc>
+        <w:tc>
+          <w:tcPr>
+            <w:tcW w:type="dxa" w:w="2880"/>
+          </w:tcPr>
+          <w:p>
+            <w:r/>
+            <w:r>
+              <w:rPr>
+                <w:sz w:val="19"/>
+              </w:rPr>
+              <w:t>Anxiety with a target. The listener who has been doing this right learns that right is not the same as chosen.</w:t>
+            </w:r>
+          </w:p>
+        </w:tc>
+        <w:tc>
+          <w:tcPr>
+            <w:tcW w:type="dxa" w:w="2736"/>
+          </w:tcPr>
+          <w:p>
+            <w:r/>
+            <w:r>
+              <w:rPr>
+                <w:sz w:val="19"/>
+              </w:rPr>
+              <w:t>Reveals that the goal they were working toward does not pay, before naming the replacement.</w:t>
+            </w:r>
+          </w:p>
+        </w:tc>
+      </w:tr>
+      <w:tr>
+        <w:tc>
+          <w:tcPr>
+            <w:tcW w:type="dxa" w:w="576"/>
+          </w:tcPr>
+          <w:p>
+            <w:r/>
+            <w:r>
+              <w:rPr>
+                <w:sz w:val="19"/>
+              </w:rPr>
               <w:t>14</w:t>
             </w:r>
           </w:p>
@@ -6941,7 +7392,7 @@
               <w:rPr>
                 <w:sz w:val="19"/>
               </w:rPr>
-              <w:t>The exact text message that gets a client to write a review that names the neighborhood and the problem.</w:t>
+              <w:t>The exact text message that gets a client to write a review naming the neighborhood and the problem.</w:t>
             </w:r>
           </w:p>
         </w:tc>
@@ -6955,7 +7406,7 @@
               <w:rPr>
                 <w:sz w:val="19"/>
               </w:rPr>
-              <w:t>Social currency, high. The agent who shares this looks like the one who found it.</w:t>
+              <w:t>Social currency, high. Forwarding it makes the sender look useful.</w:t>
             </w:r>
           </w:p>
         </w:tc>
@@ -6969,7 +7420,7 @@
               <w:rPr>
                 <w:sz w:val="19"/>
               </w:rPr>
-              <w:t>Names the failed version everybody sends first, then withholds the fix until he says it out loud.</w:t>
+              <w:t>Names the failed version everybody sends first, then withholds the fix until he says it.</w:t>
             </w:r>
           </w:p>
         </w:tc>
@@ -7013,7 +7464,7 @@
               <w:rPr>
                 <w:sz w:val="19"/>
               </w:rPr>
-              <w:t>Anxiety plus surprise. It devalues a metric the entire audience already tracks.</w:t>
+              <w:t>Anxiety plus surprise. Devalues a metric the whole audience tracks.</w:t>
             </w:r>
           </w:p>
         </w:tc>
@@ -7027,65 +7478,7 @@
               <w:rPr>
                 <w:sz w:val="19"/>
               </w:rPr>
-              <w:t>Takes something the listener thought was finished and reopens it.</w:t>
-            </w:r>
-          </w:p>
-        </w:tc>
-      </w:tr>
-      <w:tr>
-        <w:tc>
-          <w:tcPr>
-            <w:tcW w:type="dxa" w:w="576"/>
-          </w:tcPr>
-          <w:p>
-            <w:r/>
-            <w:r>
-              <w:rPr>
-                <w:sz w:val="19"/>
-              </w:rPr>
-              <w:t>7</w:t>
-            </w:r>
-          </w:p>
-        </w:tc>
-        <w:tc>
-          <w:tcPr>
-            <w:tcW w:type="dxa" w:w="3744"/>
-          </w:tcPr>
-          <w:p>
-            <w:r/>
-            <w:r>
-              <w:rPr>
-                <w:sz w:val="19"/>
-              </w:rPr>
-              <w:t>Google removed the Q and A section. What feeds the AI answer box now?</w:t>
-            </w:r>
-          </w:p>
-        </w:tc>
-        <w:tc>
-          <w:tcPr>
-            <w:tcW w:type="dxa" w:w="2880"/>
-          </w:tcPr>
-          <w:p>
-            <w:r/>
-            <w:r>
-              <w:rPr>
-                <w:sz w:val="19"/>
-              </w:rPr>
-              <w:t>Anxiety, high arousal. Something they were told to do no longer exists.</w:t>
-            </w:r>
-          </w:p>
-        </w:tc>
-        <w:tc>
-          <w:tcPr>
-            <w:tcW w:type="dxa" w:w="2736"/>
-          </w:tcPr>
-          <w:p>
-            <w:r/>
-            <w:r>
-              <w:rPr>
-                <w:sz w:val="19"/>
-              </w:rPr>
-              <w:t>A dated, checkable change, which makes the gap real rather than rhetorical.</w:t>
+              <w:t>Reopens something the listener thought was finished.</w:t>
             </w:r>
           </w:p>
         </w:tc>
@@ -7095,6 +7488,19 @@
       <w:pPr>
         <w:spacing w:after="40"/>
       </w:pPr>
+    </w:p>
+    <w:p>
+      <w:pPr>
+        <w:spacing w:after="120"/>
+      </w:pPr>
+      <w:r>
+        <w:rPr>
+          <w:b w:val="0"/>
+          <w:i/>
+          <w:sz w:val="19"/>
+        </w:rPr>
+        <w:t>Q7, the Q and A removal, dropped off the clip engine in v2. Not because it got weaker, but because Q3 now carries the same anxiety with a number attached, and two versions of the same feeling compete with each other in a clip pile. Q7 stays never-cut for the episode. It is a credibility beat, not a clip.</w:t>
+      </w:r>
     </w:p>
     <w:p>
       <w:pPr>
@@ -7171,7 +7577,7 @@
               <w:rPr>
                 <w:sz w:val="19"/>
               </w:rPr>
-              <w:t>Keep. Field by field, live is the promise that earns a comment. Question prompt is in.</w:t>
+              <w:t>Keep, unchanged from v1. Field by field, live is the promise that earns a comment.</w:t>
             </w:r>
           </w:p>
         </w:tc>
@@ -7201,7 +7607,7 @@
               <w:rPr>
                 <w:sz w:val="19"/>
               </w:rPr>
-              <w:t>Fixed. The draft was three sentences and IG buries anything past the first. Cut to one accusation plus three tags.</w:t>
+              <w:t>Keep. One accusation plus three tags, fixed in v1.</w:t>
             </w:r>
           </w:p>
         </w:tc>
@@ -7231,7 +7637,7 @@
               <w:rPr>
                 <w:sz w:val="19"/>
               </w:rPr>
-              <w:t>Fixed. The draft opened on Bobby Kerr, which means nothing to a stranger scrolling. It now opens on you have not opened it in two years.</w:t>
+              <w:t>Keep. Opens on the accusation, not on a name nobody recognizes.</w:t>
             </w:r>
           </w:p>
         </w:tc>
@@ -7261,7 +7667,7 @@
               <w:rPr>
                 <w:sz w:val="19"/>
               </w:rPr>
-              <w:t>Keep, and it is deliberately the longest. It is the only description doing search work, so Q and A removal and AI search visibility both stay in it by name.</w:t>
+              <w:t>Fixed again. The line about getting cited by AI search engines was replaced with which AI engines actually read a Google profile versus which ones do not, because that is the searchable question and it is the one the episode now answers.</w:t>
             </w:r>
           </w:p>
         </w:tc>
@@ -7291,7 +7697,7 @@
               <w:rPr>
                 <w:sz w:val="19"/>
               </w:rPr>
-              <w:t>Fixed. The draft was the Facebook copy in a suit. It now leads with the broker question, which is the only angle on this episode that is native to LinkedIn.</w:t>
+              <w:t>Keep. The broker angle is the only one native to the platform.</w:t>
             </w:r>
           </w:p>
         </w:tc>
@@ -7319,7 +7725,7 @@
           <w:b w:val="0"/>
           <w:i w:val="0"/>
         </w:rPr>
-        <w:t>MrBeast is right about minute twenty-two. The draft bridge out of Block 2 was a summary, and a summary at the halfway mark is where a listener decides they got the point and leaves. The bridge is now written to accuse: it is empty, and it stays empty unless somebody feeds it, and this is where most agents outsource themselves into invisibility. That is a re-hook, not a hand-off, and it buys the second half of the episode. Second fix from the same note: Q15, the objection question, moved from Block 1 to Block 4. In the draft it sat early, which meant the biggest reason to quit listening was raised before he had earned the right to answer it.</w:t>
+        <w:t>The v1 arc fix held: the Block 2 to Block 3 bridge accuses instead of summarizing, and Q15 stays late. The remaining risk in v2 is different and it is at the front. Q3 is now the strongest question in the first third of the episode, and it sits third, behind a client anecdote and a website comparison. MrBeast pushed to move it to the top of Block 1. It stays at position three for one reason: Q1 has to establish that he rebuilds these things for a living before he is allowed to make a claim about the future of search, or he is just another guy with a stat. The mitigation instead is the cold open, which now front-loads the being handed to the buyer as the answer language, so the listener is holding the premise before Q1 starts.</w:t>
       </w:r>
     </w:p>
     <w:p>
@@ -7342,7 +7748,7 @@
         <w:t xml:space="preserve">Curiosity mechanism (Heath): </w:t>
       </w:r>
       <w:r>
-        <w:t>Ranking is a word every agent thinks they understand. The title takes it away in four words and does not replace it until the episode does.</w:t>
+        <w:t>Two gaps stacked. The title takes away ranking, and Q3 takes away getting cited. The listener does not get a replacement for either until the guest supplies one.</w:t>
       </w:r>
     </w:p>
     <w:p>
@@ -7357,7 +7763,7 @@
         <w:t xml:space="preserve">Share driver (Berger): </w:t>
       </w:r>
       <w:r>
-        <w:t>Q14 hands the listener a script with a send button. Scripts get forwarded because forwarding one makes the sender look useful, which is social currency, not generosity.</w:t>
+        <w:t>Q14 gets forwarded because it makes the sender look useful. Q3 gets argued about, which travels differently and further.</w:t>
       </w:r>
     </w:p>
     <w:p>
@@ -7372,7 +7778,7 @@
         <w:t xml:space="preserve">Retention move (MrBeast): </w:t>
       </w:r>
       <w:r>
-        <w:t>Four blocks, each ending on something to do tonight, and a bridge at the sag point that accuses instead of summarizes.</w:t>
+        <w:t>Four blocks, each ending on something to do tonight, a bridge that accuses at the sag point, and the most valuable block now has the clock to actually finish.</w:t>
       </w:r>
     </w:p>
     <w:p>
@@ -7392,7 +7798,7 @@
           <w:b w:val="0"/>
           <w:i w:val="0"/>
         </w:rPr>
-        <w:t>Hormozi will not sign off on Block 3. His position is that commodity versus non-commodity content is the softest ten minutes in the episode, that Q9 rests on a claim the guest probably cannot evidence, and that those minutes belong to more of Q5, the field-by-field build, which is the only part of this an agent can act on with certainty. The counter is that Block 3 is where both Rapid Fire callbacks live, and dropping it strands his best story. THE EXPERIMENT: watch what happens at Q9. If he cannot produce an observed before and after, that is the answer, and on the next vendor guest we cut the belief block entirely and run six build questions instead of four.</w:t>
+        <w:t>Hormozi stood down on Block 3. The new dissent is Byron Lazine, and it is about restraint. His position: the multi-engine finding in Q3 is the most newsworthy thing in this episode, and the document deliberately keeps D.J. from pressing it, because Landmine 4 and the Q7 note both instruct him not to correct the guest on air. Byron argues that on a claim this central, protecting a first-time vendor guest costs the audience the actual answer. The counter is that a guest who feels caught stops giving you mechanism and starts giving you defense, and mechanism is the entire episode. THE EXPERIMENT: run it as written this time and listen to what the second half of Q3 produces. If he engages with it honestly, the no-correcting rule was unnecessary caution and the next vendor guest gets pressed directly. If he deflects, the rule saved the interview and we keep it.</w:t>
       </w:r>
     </w:p>
     <w:p>
@@ -7400,7 +7806,7 @@
         <w:pStyle w:val="Heading2"/>
       </w:pPr>
       <w:r>
-        <w:t>7C. EP Polish (pass 3)</w:t>
+        <w:t>7C. EP Polish, pass 3 of round two</w:t>
       </w:r>
     </w:p>
     <w:p>
@@ -7409,7 +7815,7 @@
         <w:spacing w:after="40"/>
       </w:pPr>
       <w:r>
-        <w:t>Rebuilt Q1 off the Annapolis client result instead of his origin story, because his origin story has three versions and none of them can be stated on air.</w:t>
+        <w:t>Verified the 83% claim that v1 told D.J. to assert on air, found it holds, and found a better number in the process. Rebuilt Q3, title 2, and three rows of 4D on the Pew finding.</w:t>
       </w:r>
     </w:p>
     <w:p>
@@ -7418,7 +7824,7 @@
         <w:spacing w:after="40"/>
       </w:pPr>
       <w:r>
-        <w:t>Pulled every guest-supplied number out of the cold open, the three titles, the live stream title, and all five platform descriptions. The 10x more calls line was in the draft cold open and it made the show sound like an infomercial.</w:t>
+        <w:t>Promoted the multi-engine finding from a research-brief footnote to the second half of Q3, with an instruction not to skip it.</w:t>
       </w:r>
     </w:p>
     <w:p>
@@ -7427,7 +7833,7 @@
         <w:spacing w:after="40"/>
       </w:pPr>
       <w:r>
-        <w:t>Moved Q15, the referrals objection, from Block 1 to Block 4, so the biggest reason to stop listening gets raised after he has earned the right to answer it.</w:t>
+        <w:t>Wrote the guest intro the whole document had been referring to, with a line that hands his contested resume back to him.</w:t>
       </w:r>
     </w:p>
     <w:p>
@@ -7436,7 +7842,7 @@
         <w:spacing w:after="40"/>
       </w:pPr>
       <w:r>
-        <w:t>Rewrote the Block 2 to Block 3 bridge from a summary into an accusation, because minute twenty-two was the sag.</w:t>
+        <w:t>Added the green-room brief, and put the Rapid Fire pre-brief in it, which is the only real fix for a guest who pre-sends his best material.</w:t>
       </w:r>
     </w:p>
     <w:p>
@@ -7445,7 +7851,7 @@
         <w:spacing w:after="40"/>
       </w:pPr>
       <w:r>
-        <w:t>Rewrote Q7, the Q and A question, from a correction into a comparing-notes question, and added the exact recovery line for the case where he says the feature is still there.</w:t>
+        <w:t>Moved two minutes from Block 3 to Block 4 and retimed all twenty chapter markers to match.</w:t>
       </w:r>
     </w:p>
     <w:p>
@@ -7454,7 +7860,7 @@
         <w:spacing w:after="40"/>
       </w:pPr>
       <w:r>
-        <w:t>Rewrote Q9 to demand an observed ninety-day before and after instead of accepting a story, and added the note telling D.J. not to rescue him.</w:t>
+        <w:t>Added Q10 to the never-cut list, resolving a contradiction where the document called the callbacks essential and cuttable in the same breath.</w:t>
       </w:r>
     </w:p>
     <w:p>
@@ -7463,7 +7869,7 @@
         <w:spacing w:after="40"/>
       </w:pPr>
       <w:r>
-        <w:t>Added the second half to Q2, what the website still does, purely to protect the sponsor category and the clip.</w:t>
+        <w:t>Rewrote the stat rule to separate performance claims from volume claims, which is what v1 meant and not what v1 said.</w:t>
       </w:r>
     </w:p>
     <w:p>
@@ -7472,7 +7878,7 @@
         <w:spacing w:after="40"/>
       </w:pPr>
       <w:r>
-        <w:t>Cut three questions to fit 43 minutes, and wrote the cut order and the never-cut list.</w:t>
+        <w:t>Rewrote the homework to a countable number, and rewrote the note explaining why.</w:t>
       </w:r>
     </w:p>
     <w:p>
@@ -7481,7 +7887,7 @@
         <w:spacing w:after="40"/>
       </w:pPr>
       <w:r>
-        <w:t>Demoted the Bob Jovi question to an optional human landing with an alternate, on Welsh's note, and gave it the cash-in-the-closet story as the swap.</w:t>
+        <w:t>Armed Q8 with Google's actual naming and address rules so a wrong answer does not go to air unchallenged on the one topic that can cost a listener their profile.</w:t>
       </w:r>
     </w:p>
     <w:p>
@@ -7490,7 +7896,7 @@
         <w:spacing w:after="40"/>
       </w:pPr>
       <w:r>
-        <w:t>Rewrote all twenty chapter markers so each one is a searchable headline on its own. Four of the drafted ones were labels, not headlines.</w:t>
+        <w:t>Swapped Q3 off the cut list and Q11 onto it.</w:t>
       </w:r>
     </w:p>
     <w:p>
@@ -7499,7 +7905,7 @@
         <w:spacing w:after="40"/>
       </w:pPr>
       <w:r>
-        <w:t>Rewrote the Instagram, TikTok, and LinkedIn descriptions, which were all the Facebook copy with the edges filed off.</w:t>
+        <w:t>Added the chapter-marker note about which rows to delete if the cut list gets used, on Youshaei's note.</w:t>
       </w:r>
     </w:p>
     <w:p>
@@ -7508,7 +7914,7 @@
         <w:spacing w:after="40"/>
       </w:pPr>
       <w:r>
-        <w:t>Swept the whole document for em dashes, curly quotes, and AI-speak. Zero em dashes remain.</w:t>
+        <w:t>Re-swept the document for em dashes, curly quotes, and AI-speak after every change above. Still zero.</w:t>
       </w:r>
     </w:p>
     <w:sectPr>

</xml_diff>